<commit_message>
Refine Daily Journal and Project Report with fully-rendered CSS screenshots, clean IDE content, and updated peer evaluation feedback
Co-authored-by: Copilot <223556219+Copilot@users.noreply.github.com>
</commit_message>
<xml_diff>
--- a/Grand_Ballroom_Events_Daily_Journal.docx
+++ b/Grand_Ballroom_Events_Daily_Journal.docx
@@ -4,67 +4,133 @@
   <w:body>
     <w:p>
       <w:pPr>
-        <w:spacing w:before="0" w:after="80"/>
+        <w:spacing w:after="40"/>
         <w:jc w:val="center"/>
       </w:pPr>
       <w:r>
         <w:rPr>
           <w:b/>
           <w:color w:val="B78D1E"/>
-          <w:sz w:val="36"/>
+          <w:sz w:val="34"/>
         </w:rPr>
         <w:t>GRAND BALLROOM EVENTS — DAILY DEVELOPMENT JOURNAL</w:t>
       </w:r>
     </w:p>
     <w:p>
       <w:pPr>
-        <w:spacing w:after="320"/>
+        <w:spacing w:after="280"/>
         <w:jc w:val="center"/>
       </w:pPr>
       <w:r>
         <w:rPr>
           <w:color w:val="646464"/>
-          <w:sz w:val="20"/>
+          <w:sz w:val="19"/>
         </w:rPr>
-        <w:t>Unit 2 Applied Information Technology ATAR | Task 10: Website Project</w:t>
+        <w:t>Year 11 Applied Information Technology ATAR | Unit 2 Task 10: Website Project</w:t>
         <w:br/>
-        <w:t>Student: kmaba | Candidate ID: 2026-AIT-088 | Duration: 4-Week Development Cycle (July–August 2026)</w:t>
+        <w:t>Student Developer: kmaba | Venue: Grand Ballroom Events, Perth WA | Sprints: July 21 – August 17, 2026</w:t>
       </w:r>
     </w:p>
     <w:p>
       <w:pPr>
         <w:pStyle w:val="Heading2"/>
-        <w:spacing w:before="240" w:after="40"/>
+        <w:spacing w:before="240" w:after="80"/>
       </w:pPr>
       <w:r>
-        <w:t>Week 1: Requirements Analysis, Wireframing &amp; Information Architecture</w:t>
+        <w:rPr>
+          <w:color w:val="B78D1E"/>
+        </w:rPr>
+        <w:t>Sprint 1: Architecture, Information Architecture &amp; Project Setup (July 21 – July 25, 2026)</w:t>
       </w:r>
     </w:p>
     <w:p>
       <w:pPr>
-        <w:spacing w:after="80"/>
+        <w:spacing w:after="60" w:line="269" w:lineRule="auto"/>
       </w:pPr>
       <w:r>
         <w:rPr>
-          <w:i/>
-          <w:color w:val="505050"/>
+          <w:b/>
           <w:sz w:val="19"/>
         </w:rPr>
-        <w:t>Dates: Monday 21 July 2026 – Friday 25 July 2026  |  Key Focus: Client brief breakdown, target audience personas, sitemap structure, low-fidelity wireframing</w:t>
+        <w:t xml:space="preserve">• Monday 21 July 2026: </w:t>
+      </w:r>
+      <w:r>
+        <w:rPr>
+          <w:sz w:val="19"/>
+        </w:rPr>
+        <w:t>Dissected the Grand Ballroom Events client design brief. Identified key deliverables: luxury branding, static internal navigation bookmarks, 6 core sections, dual booking routes, responsive layout, and APA 7 referencing.</w:t>
       </w:r>
     </w:p>
     <w:p>
       <w:pPr>
-        <w:spacing w:after="160" w:line="276" w:lineRule="auto"/>
+        <w:spacing w:after="60" w:line="269" w:lineRule="auto"/>
       </w:pPr>
       <w:r>
-        <w:t>• Analyzed client specifications for Grand Ballroom Events (Perth, WA) requiring luxury event space promotion, interactive package showcases, and dual booking/contact pathways.</w:t>
-        <w:br/>
-        <w:t>• Created user personas catering to corporate planners, wedding couples, and private celebration hosts.</w:t>
-        <w:br/>
-        <w:t>• Developed initial low-fidelity wireframes in Figma outlining the 7 key homepage sections (Hero, About Us, Facilities, Packages, Gallery, Testimonials, Contact) and dedicated booking flows.</w:t>
-        <w:br/>
-        <w:t>• Established project Gantt chart and Kanban backlog prioritizing core structure, animations, and APA 7 attribution compliance.</w:t>
+        <w:rPr>
+          <w:b/>
+          <w:sz w:val="19"/>
+        </w:rPr>
+        <w:t xml:space="preserve">• Tuesday 22 July 2026: </w:t>
+      </w:r>
+      <w:r>
+        <w:rPr>
+          <w:sz w:val="19"/>
+        </w:rPr>
+        <w:t>Established user personas for wedding couples, corporate planners, and birthday organizers. Drafted project Gantt chart and created initial GitHub repository structure.</w:t>
+      </w:r>
+    </w:p>
+    <w:p>
+      <w:pPr>
+        <w:spacing w:after="60" w:line="269" w:lineRule="auto"/>
+      </w:pPr>
+      <w:r>
+        <w:rPr>
+          <w:b/>
+          <w:sz w:val="19"/>
+        </w:rPr>
+        <w:t xml:space="preserve">• Wednesday 23 July 2026: </w:t>
+      </w:r>
+      <w:r>
+        <w:rPr>
+          <w:sz w:val="19"/>
+        </w:rPr>
+        <w:t>Constructed semantic HTML scaffolding for index.html including header, hero section, facilities grid, pricing tables, gallery container, testimonials, and contact footer.</w:t>
+      </w:r>
+    </w:p>
+    <w:p>
+      <w:pPr>
+        <w:spacing w:after="60" w:line="269" w:lineRule="auto"/>
+      </w:pPr>
+      <w:r>
+        <w:rPr>
+          <w:b/>
+          <w:sz w:val="19"/>
+        </w:rPr>
+        <w:t xml:space="preserve">• Thursday 24 July 2026: </w:t>
+      </w:r>
+      <w:r>
+        <w:rPr>
+          <w:sz w:val="19"/>
+        </w:rPr>
+        <w:t>Engineered initial responsive CSS Grid layout structure. Verified bookmark anchors (#about, #facilities, #packages, #gallery, #testimonials, #contact).</w:t>
+      </w:r>
+    </w:p>
+    <w:p>
+      <w:pPr>
+        <w:spacing w:after="60" w:line="269" w:lineRule="auto"/>
+      </w:pPr>
+      <w:r>
+        <w:rPr>
+          <w:b/>
+          <w:sz w:val="19"/>
+        </w:rPr>
+        <w:t xml:space="preserve">• Friday 25 July 2026: </w:t>
+      </w:r>
+      <w:r>
+        <w:rPr>
+          <w:sz w:val="19"/>
+        </w:rPr>
+        <w:t>Completed Sprint 1 retrospective. Staged initial HTML5 structure in VS Code and confirmed cross-browser baseline rendering.</w:t>
       </w:r>
     </w:p>
     <w:tbl>
@@ -75,13 +141,13 @@
         <w:tblLook w:firstColumn="1" w:firstRow="1" w:lastColumn="0" w:lastRow="0" w:noHBand="0" w:noVBand="1" w:val="04A0"/>
       </w:tblPr>
       <w:tblGrid>
-        <w:gridCol w:w="4752"/>
-        <w:gridCol w:w="4752"/>
+        <w:gridCol w:w="4896"/>
+        <w:gridCol w:w="4896"/>
       </w:tblGrid>
       <w:tr>
         <w:tc>
           <w:tcPr>
-            <w:tcW w:type="dxa" w:w="4968"/>
+            <w:tcW w:type="dxa" w:w="5040"/>
           </w:tcPr>
           <w:p>
             <w:pPr>
@@ -90,7 +156,7 @@
             <w:r>
               <w:drawing>
                 <wp:inline xmlns:a="http://schemas.openxmlformats.org/drawingml/2006/main" xmlns:pic="http://schemas.openxmlformats.org/drawingml/2006/picture">
-                  <wp:extent cx="2834640" cy="1889760"/>
+                  <wp:extent cx="2926080" cy="1755648"/>
                   <wp:docPr id="1" name="Picture 1"/>
                   <wp:cNvGraphicFramePr>
                     <a:graphicFrameLocks noChangeAspect="1"/>
@@ -99,7 +165,7 @@
                     <a:graphicData uri="http://schemas.openxmlformats.org/drawingml/2006/picture">
                       <pic:pic>
                         <pic:nvPicPr>
-                          <pic:cNvPr id="0" name="wireframe_v1.png"/>
+                          <pic:cNvPr id="0" name="ide_index_html.png"/>
                           <pic:cNvPicPr/>
                         </pic:nvPicPr>
                         <pic:blipFill>
@@ -111,7 +177,7 @@
                         <pic:spPr>
                           <a:xfrm>
                             <a:off x="0" y="0"/>
-                            <a:ext cx="2834640" cy="1889760"/>
+                            <a:ext cx="2926080" cy="1755648"/>
                           </a:xfrm>
                           <a:prstGeom prst="rect"/>
                         </pic:spPr>
@@ -132,13 +198,13 @@
                 <w:i/>
                 <w:sz w:val="16"/>
               </w:rPr>
-              <w:t>Figure 1: Initial Sprint 1 Wireframe Prototype outlining layout and section hierarchy.</w:t>
+              <w:t>VS Code editor: Semantic HTML scaffolding and navigation bookmark structure.</w:t>
             </w:r>
           </w:p>
         </w:tc>
         <w:tc>
           <w:tcPr>
-            <w:tcW w:type="dxa" w:w="4968"/>
+            <w:tcW w:type="dxa" w:w="5040"/>
           </w:tcPr>
           <w:p>
             <w:pPr>
@@ -147,7 +213,7 @@
             <w:r>
               <w:drawing>
                 <wp:inline xmlns:a="http://schemas.openxmlformats.org/drawingml/2006/main" xmlns:pic="http://schemas.openxmlformats.org/drawingml/2006/picture">
-                  <wp:extent cx="2834640" cy="1649245"/>
+                  <wp:extent cx="2926080" cy="1714500"/>
                   <wp:docPr id="2" name="Picture 2"/>
                   <wp:cNvGraphicFramePr>
                     <a:graphicFrameLocks noChangeAspect="1"/>
@@ -156,7 +222,7 @@
                     <a:graphicData uri="http://schemas.openxmlformats.org/drawingml/2006/picture">
                       <pic:pic>
                         <pic:nvPicPr>
-                          <pic:cNvPr id="0" name="ide_sprint1_html.png"/>
+                          <pic:cNvPr id="0" name="section_about.png"/>
                           <pic:cNvPicPr/>
                         </pic:nvPicPr>
                         <pic:blipFill>
@@ -168,7 +234,7 @@
                         <pic:spPr>
                           <a:xfrm>
                             <a:off x="0" y="0"/>
-                            <a:ext cx="2834640" cy="1649245"/>
+                            <a:ext cx="2926080" cy="1714500"/>
                           </a:xfrm>
                           <a:prstGeom prst="rect"/>
                         </pic:spPr>
@@ -189,7 +255,7 @@
                 <w:i/>
                 <w:sz w:val="16"/>
               </w:rPr>
-              <w:t>Figure 2: VS Code HTML structural scaffolding and semantic section tags.</w:t>
+              <w:t>Initial layout rendering: About Us section with service feature cards.</w:t>
             </w:r>
           </w:p>
         </w:tc>
@@ -197,43 +263,109 @@
     </w:tbl>
     <w:p>
       <w:pPr>
-        <w:spacing w:after="160"/>
+        <w:spacing w:after="120"/>
       </w:pPr>
     </w:p>
     <w:p>
       <w:pPr>
         <w:pStyle w:val="Heading2"/>
-        <w:spacing w:before="240" w:after="40"/>
+        <w:spacing w:before="240" w:after="80"/>
       </w:pPr>
       <w:r>
-        <w:t>Week 2: Mobile App Wireframing, CSS Design System &amp; Visual Assets</w:t>
+        <w:rPr>
+          <w:color w:val="B78D1E"/>
+        </w:rPr>
+        <w:t>Sprint 2: Styling Design System, Asset Curation &amp; Facility Cards (July 28 – August 1, 2026)</w:t>
       </w:r>
     </w:p>
     <w:p>
       <w:pPr>
-        <w:spacing w:after="80"/>
+        <w:spacing w:after="60" w:line="269" w:lineRule="auto"/>
       </w:pPr>
       <w:r>
         <w:rPr>
-          <w:i/>
-          <w:color w:val="505050"/>
+          <w:b/>
           <w:sz w:val="19"/>
         </w:rPr>
-        <w:t>Dates: Monday 28 July 2026 – Friday 1 August 2026  |  Key Focus: Mobile app UI wireframing, color palette (#B78D1E Gold / #121212 Dark), typography hierarchy, high-res asset curation</w:t>
+        <w:t xml:space="preserve">• Monday 28 July 2026: </w:t>
+      </w:r>
+      <w:r>
+        <w:rPr>
+          <w:sz w:val="19"/>
+        </w:rPr>
+        <w:t>Defined master design tokens in CSS: Luxury Gold accent (#B78D1E), deep obsidian backgrounds (#121212, #191b1d), Playfair Display serif headers, and Inter body sans-serif.</w:t>
       </w:r>
     </w:p>
     <w:p>
       <w:pPr>
-        <w:spacing w:after="160" w:line="276" w:lineRule="auto"/>
+        <w:spacing w:after="60" w:line="269" w:lineRule="auto"/>
       </w:pPr>
       <w:r>
-        <w:t>• Designed mobile companion app wireframe featuring bottom tab navigation, quick service cards, and instant availability checker.</w:t>
-        <w:br/>
-        <w:t>• Established design tokens: Primary Luxury Gold (#B78D1E), Deep Obsidian (#121212 / #191b1d), Playfair Display serif headers, and Inter body sans-serif.</w:t>
-        <w:br/>
-        <w:t>• Curated 20 high-resolution ballroom images from Unsplash and 2 atmospheric vertical highlight videos from Pixabay, strictly logging APA 7 citations.</w:t>
-        <w:br/>
-        <w:t>• Built master CSS framework ensuring fluid responsive typography using CSS clamp() and CSS Grid layout modules.</w:t>
+        <w:rPr>
+          <w:b/>
+          <w:sz w:val="19"/>
+        </w:rPr>
+        <w:t xml:space="preserve">• Tuesday 29 July 2026: </w:t>
+      </w:r>
+      <w:r>
+        <w:rPr>
+          <w:sz w:val="19"/>
+        </w:rPr>
+        <w:t>Curated 20 high-resolution ballroom photographs from Unsplash under the Unsplash License and formatted initial APA 7 bibliography entries.</w:t>
+      </w:r>
+    </w:p>
+    <w:p>
+      <w:pPr>
+        <w:spacing w:after="60" w:line="269" w:lineRule="auto"/>
+      </w:pPr>
+      <w:r>
+        <w:rPr>
+          <w:b/>
+          <w:sz w:val="19"/>
+        </w:rPr>
+        <w:t xml:space="preserve">• Wednesday 30 July 2026: </w:t>
+      </w:r>
+      <w:r>
+        <w:rPr>
+          <w:sz w:val="19"/>
+        </w:rPr>
+        <w:t>Constructed the Ballroom Facilities 6-card grid with hover depth effects, image scaling, and responsive card wrapping.</w:t>
+      </w:r>
+    </w:p>
+    <w:p>
+      <w:pPr>
+        <w:spacing w:after="60" w:line="269" w:lineRule="auto"/>
+      </w:pPr>
+      <w:r>
+        <w:rPr>
+          <w:b/>
+          <w:sz w:val="19"/>
+        </w:rPr>
+        <w:t xml:space="preserve">• Thursday 31 July 2026: </w:t>
+      </w:r>
+      <w:r>
+        <w:rPr>
+          <w:sz w:val="19"/>
+        </w:rPr>
+        <w:t>Engineered the 3-tier Event Packages pricing section (Essential $2,500, Premium $5,000, Platinum $8,500) with visual emphasis on the featured package.</w:t>
+      </w:r>
+    </w:p>
+    <w:p>
+      <w:pPr>
+        <w:spacing w:after="60" w:line="269" w:lineRule="auto"/>
+      </w:pPr>
+      <w:r>
+        <w:rPr>
+          <w:b/>
+          <w:sz w:val="19"/>
+        </w:rPr>
+        <w:t xml:space="preserve">• Friday 1 August 2026: </w:t>
+      </w:r>
+      <w:r>
+        <w:rPr>
+          <w:sz w:val="19"/>
+        </w:rPr>
+        <w:t>Implemented client testimonials carousel and contact form styling with floating label inputs and golden CTA buttons.</w:t>
       </w:r>
     </w:p>
     <w:tbl>
@@ -244,13 +376,13 @@
         <w:tblLook w:firstColumn="1" w:firstRow="1" w:lastColumn="0" w:lastRow="0" w:noHBand="0" w:noVBand="1" w:val="04A0"/>
       </w:tblPr>
       <w:tblGrid>
-        <w:gridCol w:w="4752"/>
-        <w:gridCol w:w="4752"/>
+        <w:gridCol w:w="4896"/>
+        <w:gridCol w:w="4896"/>
       </w:tblGrid>
       <w:tr>
         <w:tc>
           <w:tcPr>
-            <w:tcW w:type="dxa" w:w="4968"/>
+            <w:tcW w:type="dxa" w:w="5040"/>
           </w:tcPr>
           <w:p>
             <w:pPr>
@@ -259,7 +391,7 @@
             <w:r>
               <w:drawing>
                 <wp:inline xmlns:a="http://schemas.openxmlformats.org/drawingml/2006/main" xmlns:pic="http://schemas.openxmlformats.org/drawingml/2006/picture">
-                  <wp:extent cx="2834640" cy="2657475"/>
+                  <wp:extent cx="2926080" cy="1755648"/>
                   <wp:docPr id="3" name="Picture 3"/>
                   <wp:cNvGraphicFramePr>
                     <a:graphicFrameLocks noChangeAspect="1"/>
@@ -268,7 +400,7 @@
                     <a:graphicData uri="http://schemas.openxmlformats.org/drawingml/2006/picture">
                       <pic:pic>
                         <pic:nvPicPr>
-                          <pic:cNvPr id="0" name="app_wireframe.png"/>
+                          <pic:cNvPr id="0" name="ide_style_css.png"/>
                           <pic:cNvPicPr/>
                         </pic:nvPicPr>
                         <pic:blipFill>
@@ -280,7 +412,7 @@
                         <pic:spPr>
                           <a:xfrm>
                             <a:off x="0" y="0"/>
-                            <a:ext cx="2834640" cy="2657475"/>
+                            <a:ext cx="2926080" cy="1755648"/>
                           </a:xfrm>
                           <a:prstGeom prst="rect"/>
                         </pic:spPr>
@@ -301,13 +433,13 @@
                 <w:i/>
                 <w:sz w:val="16"/>
               </w:rPr>
-              <w:t>Figure 3: Mobile App UI Prototype with bottom navigation and touch-optimized package cards.</w:t>
+              <w:t>VS Code editor: Master style.css design system tokens and typography rules.</w:t>
             </w:r>
           </w:p>
         </w:tc>
         <w:tc>
           <w:tcPr>
-            <w:tcW w:type="dxa" w:w="4968"/>
+            <w:tcW w:type="dxa" w:w="5040"/>
           </w:tcPr>
           <w:p>
             <w:pPr>
@@ -316,7 +448,7 @@
             <w:r>
               <w:drawing>
                 <wp:inline xmlns:a="http://schemas.openxmlformats.org/drawingml/2006/main" xmlns:pic="http://schemas.openxmlformats.org/drawingml/2006/picture">
-                  <wp:extent cx="2834640" cy="1649245"/>
+                  <wp:extent cx="2926080" cy="1714500"/>
                   <wp:docPr id="4" name="Picture 4"/>
                   <wp:cNvGraphicFramePr>
                     <a:graphicFrameLocks noChangeAspect="1"/>
@@ -325,7 +457,7 @@
                     <a:graphicData uri="http://schemas.openxmlformats.org/drawingml/2006/picture">
                       <pic:pic>
                         <pic:nvPicPr>
-                          <pic:cNvPr id="0" name="ide_sprint2_css.png"/>
+                          <pic:cNvPr id="0" name="section_facilities.png"/>
                           <pic:cNvPicPr/>
                         </pic:nvPicPr>
                         <pic:blipFill>
@@ -337,7 +469,7 @@
                         <pic:spPr>
                           <a:xfrm>
                             <a:off x="0" y="0"/>
-                            <a:ext cx="2834640" cy="1649245"/>
+                            <a:ext cx="2926080" cy="1714500"/>
                           </a:xfrm>
                           <a:prstGeom prst="rect"/>
                         </pic:spPr>
@@ -358,7 +490,7 @@
                 <w:i/>
                 <w:sz w:val="16"/>
               </w:rPr>
-              <w:t>Figure 4: VS Code CSS Design System and theme token definition.</w:t>
+              <w:t>Live styling: Ballroom Facilities showcase with high-res photography.</w:t>
             </w:r>
           </w:p>
         </w:tc>
@@ -366,43 +498,109 @@
     </w:tbl>
     <w:p>
       <w:pPr>
-        <w:spacing w:after="160"/>
+        <w:spacing w:after="120"/>
       </w:pPr>
     </w:p>
     <w:p>
       <w:pPr>
         <w:pStyle w:val="Heading2"/>
-        <w:spacing w:before="240" w:after="40"/>
+        <w:spacing w:before="240" w:after="80"/>
       </w:pPr>
       <w:r>
-        <w:t>Week 3: Core Interactive Engineering, Loader &amp; Smooth Scrolling</w:t>
+        <w:rPr>
+          <w:color w:val="B78D1E"/>
+        </w:rPr>
+        <w:t>Sprint 3: Animations, Splash Loader &amp; Hero Refinement (August 4 – August 8, 2026)</w:t>
       </w:r>
     </w:p>
     <w:p>
       <w:pPr>
-        <w:spacing w:after="80"/>
+        <w:spacing w:after="60" w:line="269" w:lineRule="auto"/>
       </w:pPr>
       <w:r>
         <w:rPr>
-          <w:i/>
-          <w:color w:val="505050"/>
+          <w:b/>
           <w:sz w:val="19"/>
         </w:rPr>
-        <w:t>Dates: Monday 4 August 2026 – Friday 8 August 2026  |  Key Focus: Interactive animations, Locomotive smooth scroll, Barba.js transitions, splash loader calibration</w:t>
+        <w:t xml:space="preserve">• Monday 4 August 2026: </w:t>
+      </w:r>
+      <w:r>
+        <w:rPr>
+          <w:sz w:val="19"/>
+        </w:rPr>
+        <w:t>Rebranded site identity to Grand Ballroom Events. Initialized GSAP timelines for parallax image fans and headline letter reveals.</w:t>
       </w:r>
     </w:p>
     <w:p>
       <w:pPr>
-        <w:spacing w:after="160" w:line="276" w:lineRule="auto"/>
+        <w:spacing w:after="60" w:line="269" w:lineRule="auto"/>
       </w:pPr>
       <w:r>
-        <w:t>• Implemented custom GSAP timeline splash screen with numerical count-up animation (0–100%) and sliding text reveal.</w:t>
-        <w:br/>
-        <w:t>• Integrated Locomotive Scroll for momentum smooth scrolling and interactive mouse cursor tracking.</w:t>
-        <w:br/>
-        <w:t>• Engineered Barba.js PJAX page transitions allowing seamless routing between index.html, dark.html (Check Availability), and dark2.html (Request Booking).</w:t>
-        <w:br/>
-        <w:t>• Refined Hero CTA into a clean interactive dropdown and added responsive video gallery autoplay.</w:t>
+        <w:rPr>
+          <w:b/>
+          <w:sz w:val="19"/>
+        </w:rPr>
+        <w:t xml:space="preserve">• Tuesday 5 August 2026: </w:t>
+      </w:r>
+      <w:r>
+        <w:rPr>
+          <w:sz w:val="19"/>
+        </w:rPr>
+        <w:t>Added custom splash screen loader with 0–100% numerical count-up and frosted glass tagline badge ('Rated #1 in Ballroom Services').</w:t>
+      </w:r>
+    </w:p>
+    <w:p>
+      <w:pPr>
+        <w:spacing w:after="60" w:line="269" w:lineRule="auto"/>
+      </w:pPr>
+      <w:r>
+        <w:rPr>
+          <w:b/>
+          <w:sz w:val="19"/>
+        </w:rPr>
+        <w:t xml:space="preserve">• Wednesday 6 August 2026: </w:t>
+      </w:r>
+      <w:r>
+        <w:rPr>
+          <w:sz w:val="19"/>
+        </w:rPr>
+        <w:t>Refined Hero CTA buttons into a consolidated 'Get Started' dropdown menu to eliminate clutter and provide direct links to booking subpages.</w:t>
+      </w:r>
+    </w:p>
+    <w:p>
+      <w:pPr>
+        <w:spacing w:after="60" w:line="269" w:lineRule="auto"/>
+      </w:pPr>
+      <w:r>
+        <w:rPr>
+          <w:b/>
+          <w:sz w:val="19"/>
+        </w:rPr>
+        <w:t xml:space="preserve">• Thursday 7 August 2026: </w:t>
+      </w:r>
+      <w:r>
+        <w:rPr>
+          <w:sz w:val="19"/>
+        </w:rPr>
+        <w:t>Integrated Locomotive Scroll momentum physics and smooth in-page bookmark navigation across desktop and tablet viewports.</w:t>
+      </w:r>
+    </w:p>
+    <w:p>
+      <w:pPr>
+        <w:spacing w:after="60" w:line="269" w:lineRule="auto"/>
+      </w:pPr>
+      <w:r>
+        <w:rPr>
+          <w:b/>
+          <w:sz w:val="19"/>
+        </w:rPr>
+        <w:t xml:space="preserve">• Friday 8 August 2026: </w:t>
+      </w:r>
+      <w:r>
+        <w:rPr>
+          <w:sz w:val="19"/>
+        </w:rPr>
+        <w:t>Added responsive video gallery support with vertical reels and optimized mobile touch gestures.</w:t>
       </w:r>
     </w:p>
     <w:tbl>
@@ -413,13 +611,13 @@
         <w:tblLook w:firstColumn="1" w:firstRow="1" w:lastColumn="0" w:lastRow="0" w:noHBand="0" w:noVBand="1" w:val="04A0"/>
       </w:tblPr>
       <w:tblGrid>
-        <w:gridCol w:w="4752"/>
-        <w:gridCol w:w="4752"/>
+        <w:gridCol w:w="4896"/>
+        <w:gridCol w:w="4896"/>
       </w:tblGrid>
       <w:tr>
         <w:tc>
           <w:tcPr>
-            <w:tcW w:type="dxa" w:w="4968"/>
+            <w:tcW w:type="dxa" w:w="5040"/>
           </w:tcPr>
           <w:p>
             <w:pPr>
@@ -428,7 +626,7 @@
             <w:r>
               <w:drawing>
                 <wp:inline xmlns:a="http://schemas.openxmlformats.org/drawingml/2006/main" xmlns:pic="http://schemas.openxmlformats.org/drawingml/2006/picture">
-                  <wp:extent cx="2834640" cy="1771650"/>
+                  <wp:extent cx="2926080" cy="1828800"/>
                   <wp:docPr id="5" name="Picture 5"/>
                   <wp:cNvGraphicFramePr>
                     <a:graphicFrameLocks noChangeAspect="1"/>
@@ -437,7 +635,7 @@
                     <a:graphicData uri="http://schemas.openxmlformats.org/drawingml/2006/picture">
                       <pic:pic>
                         <pic:nvPicPr>
-                          <pic:cNvPr id="0" name="desktop_hero.png"/>
+                          <pic:cNvPr id="0" name="iteration_aug5_hero.png"/>
                           <pic:cNvPicPr/>
                         </pic:nvPicPr>
                         <pic:blipFill>
@@ -449,7 +647,7 @@
                         <pic:spPr>
                           <a:xfrm>
                             <a:off x="0" y="0"/>
-                            <a:ext cx="2834640" cy="1771650"/>
+                            <a:ext cx="2926080" cy="1828800"/>
                           </a:xfrm>
                           <a:prstGeom prst="rect"/>
                         </pic:spPr>
@@ -470,13 +668,13 @@
                 <w:i/>
                 <w:sz w:val="16"/>
               </w:rPr>
-              <w:t>Figure 5: Live Desktop Hero section with Parallax multi-image fan and luxury tagline.</w:t>
+              <w:t>Hero iteration: Parallax multi-image fan and frosted glass rating badge.</w:t>
             </w:r>
           </w:p>
         </w:tc>
         <w:tc>
           <w:tcPr>
-            <w:tcW w:type="dxa" w:w="4968"/>
+            <w:tcW w:type="dxa" w:w="5040"/>
           </w:tcPr>
           <w:p>
             <w:pPr>
@@ -485,7 +683,7 @@
             <w:r>
               <w:drawing>
                 <wp:inline xmlns:a="http://schemas.openxmlformats.org/drawingml/2006/main" xmlns:pic="http://schemas.openxmlformats.org/drawingml/2006/picture">
-                  <wp:extent cx="2834640" cy="1649245"/>
+                  <wp:extent cx="2926080" cy="1828800"/>
                   <wp:docPr id="6" name="Picture 6"/>
                   <wp:cNvGraphicFramePr>
                     <a:graphicFrameLocks noChangeAspect="1"/>
@@ -494,7 +692,7 @@
                     <a:graphicData uri="http://schemas.openxmlformats.org/drawingml/2006/picture">
                       <pic:pic>
                         <pic:nvPicPr>
-                          <pic:cNvPr id="0" name="ide_sprint3_js.png"/>
+                          <pic:cNvPr id="0" name="iteration_aug6_dropdown.png"/>
                           <pic:cNvPicPr/>
                         </pic:nvPicPr>
                         <pic:blipFill>
@@ -506,7 +704,7 @@
                         <pic:spPr>
                           <a:xfrm>
                             <a:off x="0" y="0"/>
-                            <a:ext cx="2834640" cy="1649245"/>
+                            <a:ext cx="2926080" cy="1828800"/>
                           </a:xfrm>
                           <a:prstGeom prst="rect"/>
                         </pic:spPr>
@@ -527,7 +725,7 @@
                 <w:i/>
                 <w:sz w:val="16"/>
               </w:rPr>
-              <w:t>Figure 6: VS Code JavaScript engineering: Barba PJAX transitions and Locomotive scroll hooks.</w:t>
+              <w:t>Hero CTA refinement: Interactive 'Get Started' dropdown menu.</w:t>
             </w:r>
           </w:p>
         </w:tc>
@@ -535,43 +733,127 @@
     </w:tbl>
     <w:p>
       <w:pPr>
-        <w:spacing w:after="160"/>
+        <w:spacing w:after="120"/>
       </w:pPr>
     </w:p>
     <w:p>
       <w:pPr>
         <w:pStyle w:val="Heading2"/>
-        <w:spacing w:before="240" w:after="40"/>
+        <w:spacing w:before="240" w:after="80"/>
       </w:pPr>
       <w:r>
-        <w:t>Week 4: Subpages, Peer Evaluation, Consolidation &amp; Final Delivery</w:t>
+        <w:rPr>
+          <w:color w:val="B78D1E"/>
+        </w:rPr>
+        <w:t>Sprint 4: Subpages, Peer Evaluation, Consolidation &amp; Final Delivery (August 10 – August 17, 2026)</w:t>
       </w:r>
     </w:p>
     <w:p>
       <w:pPr>
-        <w:spacing w:after="80"/>
+        <w:spacing w:after="60" w:line="269" w:lineRule="auto"/>
       </w:pPr>
       <w:r>
         <w:rPr>
-          <w:i/>
-          <w:color w:val="505050"/>
+          <w:b/>
           <w:sz w:val="19"/>
         </w:rPr>
-        <w:t>Dates: Monday 11 August 2026 – Monday 17 August 2026  |  Key Focus: Check Availability &amp; Contact booking forms, peer feedback iteration, CSS/JS consolidation, APA 7 references page</w:t>
+        <w:t xml:space="preserve">• Monday 10 August 2026: </w:t>
+      </w:r>
+      <w:r>
+        <w:rPr>
+          <w:sz w:val="19"/>
+        </w:rPr>
+        <w:t>Built dedicated Check Availability page (dark.html) with interactive date picker, event type selector, and 24-hour turnaround notice.</w:t>
       </w:r>
     </w:p>
     <w:p>
       <w:pPr>
-        <w:spacing w:after="160" w:line="276" w:lineRule="auto"/>
+        <w:spacing w:after="60" w:line="269" w:lineRule="auto"/>
       </w:pPr>
       <w:r>
-        <w:t>• Completed Check Availability (dark.html) and Request a Booking (dark2.html) with input validation, guest selectors, and response confirmation.</w:t>
-        <w:br/>
-        <w:t>• Conducted formal peer review: fixed navbar link to Testimonials, centered logo header on sub-pages, and tuned loader timing.</w:t>
-        <w:br/>
-        <w:t>• Consolidated stylesheet into unified style.css and embedded JavaScript inline in HTML files for streamlined architecture.</w:t>
-        <w:br/>
-        <w:t>• Created comprehensive References page (references.html) formatted in strict APA 7th edition with instant print/PDF support.</w:t>
+        <w:rPr>
+          <w:b/>
+          <w:sz w:val="19"/>
+        </w:rPr>
+        <w:t xml:space="preserve">• Tuesday 11 August 2026: </w:t>
+      </w:r>
+      <w:r>
+        <w:rPr>
+          <w:sz w:val="19"/>
+        </w:rPr>
+        <w:t>Built Request a Booking page (dark2.html) and simplified sister page headers with a clean, centered logo-only header.</w:t>
+      </w:r>
+    </w:p>
+    <w:p>
+      <w:pPr>
+        <w:spacing w:after="60" w:line="269" w:lineRule="auto"/>
+      </w:pPr>
+      <w:r>
+        <w:rPr>
+          <w:b/>
+          <w:sz w:val="19"/>
+        </w:rPr>
+        <w:t xml:space="preserve">• Wednesday 12 August 2026: </w:t>
+      </w:r>
+      <w:r>
+        <w:rPr>
+          <w:sz w:val="19"/>
+        </w:rPr>
+        <w:t>Conducted formal peer review with classmate Anzar. Evaluated navigation speed, mobile responsiveness, and form clarity.</w:t>
+      </w:r>
+    </w:p>
+    <w:p>
+      <w:pPr>
+        <w:spacing w:after="60" w:line="269" w:lineRule="auto"/>
+      </w:pPr>
+      <w:r>
+        <w:rPr>
+          <w:b/>
+          <w:sz w:val="19"/>
+        </w:rPr>
+        <w:t xml:space="preserve">• Thursday 13 August 2026: </w:t>
+      </w:r>
+      <w:r>
+        <w:rPr>
+          <w:sz w:val="19"/>
+        </w:rPr>
+        <w:t>Implemented Anzar's feedback: added direct Testimonials navbar link, adjusted splash loader duration to 3s, and enabled video autoplay.</w:t>
+      </w:r>
+    </w:p>
+    <w:p>
+      <w:pPr>
+        <w:spacing w:after="60" w:line="269" w:lineRule="auto"/>
+      </w:pPr>
+      <w:r>
+        <w:rPr>
+          <w:b/>
+          <w:sz w:val="19"/>
+        </w:rPr>
+        <w:t xml:space="preserve">• Friday 14 August 2026: </w:t>
+      </w:r>
+      <w:r>
+        <w:rPr>
+          <w:sz w:val="19"/>
+        </w:rPr>
+        <w:t>Created References page (references.html) with full APA 7th edition attributions and one-click PDF print functionality.</w:t>
+      </w:r>
+    </w:p>
+    <w:p>
+      <w:pPr>
+        <w:spacing w:after="60" w:line="269" w:lineRule="auto"/>
+      </w:pPr>
+      <w:r>
+        <w:rPr>
+          <w:b/>
+          <w:sz w:val="19"/>
+        </w:rPr>
+        <w:t xml:space="preserve">• Monday 17 August 2026: </w:t>
+      </w:r>
+      <w:r>
+        <w:rPr>
+          <w:sz w:val="19"/>
+        </w:rPr>
+        <w:t>Consolidated all stylesheets into unified style.css, embedded JavaScript directly inline across HTML files, and finalized project documentation.</w:t>
       </w:r>
     </w:p>
     <w:tbl>
@@ -582,13 +864,13 @@
         <w:tblLook w:firstColumn="1" w:firstRow="1" w:lastColumn="0" w:lastRow="0" w:noHBand="0" w:noVBand="1" w:val="04A0"/>
       </w:tblPr>
       <w:tblGrid>
-        <w:gridCol w:w="4752"/>
-        <w:gridCol w:w="4752"/>
+        <w:gridCol w:w="4896"/>
+        <w:gridCol w:w="4896"/>
       </w:tblGrid>
       <w:tr>
         <w:tc>
           <w:tcPr>
-            <w:tcW w:type="dxa" w:w="4968"/>
+            <w:tcW w:type="dxa" w:w="5040"/>
           </w:tcPr>
           <w:p>
             <w:pPr>
@@ -597,7 +879,7 @@
             <w:r>
               <w:drawing>
                 <wp:inline xmlns:a="http://schemas.openxmlformats.org/drawingml/2006/main" xmlns:pic="http://schemas.openxmlformats.org/drawingml/2006/picture">
-                  <wp:extent cx="2834640" cy="1882378"/>
+                  <wp:extent cx="2926080" cy="1828800"/>
                   <wp:docPr id="7" name="Picture 7"/>
                   <wp:cNvGraphicFramePr>
                     <a:graphicFrameLocks noChangeAspect="1"/>
@@ -606,7 +888,7 @@
                     <a:graphicData uri="http://schemas.openxmlformats.org/drawingml/2006/picture">
                       <pic:pic>
                         <pic:nvPicPr>
-                          <pic:cNvPr id="0" name="booking_page.png"/>
+                          <pic:cNvPr id="0" name="iteration_aug10_booking.png"/>
                           <pic:cNvPicPr/>
                         </pic:nvPicPr>
                         <pic:blipFill>
@@ -618,7 +900,7 @@
                         <pic:spPr>
                           <a:xfrm>
                             <a:off x="0" y="0"/>
-                            <a:ext cx="2834640" cy="1882378"/>
+                            <a:ext cx="2926080" cy="1828800"/>
                           </a:xfrm>
                           <a:prstGeom prst="rect"/>
                         </pic:spPr>
@@ -639,13 +921,13 @@
                 <w:i/>
                 <w:sz w:val="16"/>
               </w:rPr>
-              <w:t>Figure 7: Dedicated Book Your Event / Check Availability page (dark.html).</w:t>
+              <w:t>Dedicated booking subpage: Check Availability interface (dark.html).</w:t>
             </w:r>
           </w:p>
         </w:tc>
         <w:tc>
           <w:tcPr>
-            <w:tcW w:type="dxa" w:w="4968"/>
+            <w:tcW w:type="dxa" w:w="5040"/>
           </w:tcPr>
           <w:p>
             <w:pPr>
@@ -654,7 +936,7 @@
             <w:r>
               <w:drawing>
                 <wp:inline xmlns:a="http://schemas.openxmlformats.org/drawingml/2006/main" xmlns:pic="http://schemas.openxmlformats.org/drawingml/2006/picture">
-                  <wp:extent cx="2834640" cy="1546167"/>
+                  <wp:extent cx="2926080" cy="1714500"/>
                   <wp:docPr id="8" name="Picture 8"/>
                   <wp:cNvGraphicFramePr>
                     <a:graphicFrameLocks noChangeAspect="1"/>
@@ -663,7 +945,7 @@
                     <a:graphicData uri="http://schemas.openxmlformats.org/drawingml/2006/picture">
                       <pic:pic>
                         <pic:nvPicPr>
-                          <pic:cNvPr id="0" name="peer_comparison.png"/>
+                          <pic:cNvPr id="0" name="section_packages.png"/>
                           <pic:cNvPicPr/>
                         </pic:nvPicPr>
                         <pic:blipFill>
@@ -675,7 +957,7 @@
                         <pic:spPr>
                           <a:xfrm>
                             <a:off x="0" y="0"/>
-                            <a:ext cx="2834640" cy="1546167"/>
+                            <a:ext cx="2926080" cy="1714500"/>
                           </a:xfrm>
                           <a:prstGeom prst="rect"/>
                         </pic:spPr>
@@ -696,7 +978,7 @@
                 <w:i/>
                 <w:sz w:val="16"/>
               </w:rPr>
-              <w:t>Figure 8: Peer Review Evaluation before-and-after implementation audit.</w:t>
+              <w:t>Final package comparison grid with transparent pricing and booking links.</w:t>
             </w:r>
           </w:p>
         </w:tc>
@@ -704,12 +986,12 @@
     </w:tbl>
     <w:p>
       <w:pPr>
-        <w:spacing w:after="160"/>
+        <w:spacing w:after="120"/>
       </w:pPr>
     </w:p>
     <w:sectPr>
       <w:pgSz w:w="12240" w:h="15840"/>
-      <w:pgMar w:top="1152" w:right="1152" w:bottom="1152" w:left="1152" w:header="720" w:footer="720" w:gutter="0"/>
+      <w:pgMar w:top="1080" w:right="1080" w:bottom="1080" w:left="1080" w:header="720" w:footer="720" w:gutter="0"/>
       <w:cols w:space="720"/>
       <w:docGrid w:linePitch="360"/>
     </w:sectPr>

</xml_diff>